<commit_message>
Hello82 v1.1: correct KAMP LA misattribution, repoint to 82WORLD
- KAMP LA is owned/operated by KAMP Global (Tim Kim) + Eventim Live Asia — not Hello82
- Hello82's festival is 82WORLD : LA (Oct 17–18, 2026), a first-year outdoor event
- Tightened GMV band ($50K–$1.2M), annual ($4–$9M), EV ($14–$32M) after removing KAMP revenue
- Replaced venue footprint bullet with PLAY82 pop-ups + Fan Spaces + 82WORLD
- Deep Dive subhead carries correction note (v1.1)
- Rebuilt strategic dossier with v1.1 cover, Research Correction callout, and all 3 financial model revisions
</commit_message>
<xml_diff>
--- a/public/dossiers/hello82-strategic-dossier.docx
+++ b/public/dossiers/hello82-strategic-dossier.docx
@@ -133,7 +133,7 @@
           <w:sz w:val="20"/>
           <w:szCs w:val="20"/>
         </w:rPr>
-        <w:t xml:space="preserve">Date: April 2026</w:t>
+        <w:t xml:space="preserve">Date: April 2026  ·  Version 1.1 (KAMP correction)</w:t>
       </w:r>
     </w:p>
     <w:p>
@@ -174,6 +174,36 @@
     </w:p>
     <w:p>
       <w:pPr>
+        <w:pBdr>
+          <w:top w:val="single" w:color="FD3737" w:sz="12" w:space="6"/>
+          <w:bottom w:val="single" w:color="FD3737" w:sz="12" w:space="6"/>
+        </w:pBdr>
+        <w:spacing w:after="240" w:before="120"/>
+        <w:ind w:left="200"/>
+      </w:pPr>
+      <w:r>
+        <w:rPr>
+          <w:rFonts w:ascii="Arial" w:cs="Arial" w:eastAsia="Arial" w:hAnsi="Arial"/>
+          <w:b/>
+          <w:bCs/>
+          <w:color w:val="FD3737"/>
+          <w:sz w:val="20"/>
+          <w:szCs w:val="20"/>
+        </w:rPr>
+        <w:t xml:space="preserve">RESEARCH CORRECTION (v1.1 — April 2026):  </w:t>
+      </w:r>
+      <w:r>
+        <w:rPr>
+          <w:rFonts w:ascii="Arial" w:cs="Arial" w:eastAsia="Arial" w:hAnsi="Arial"/>
+          <w:color w:val="111111"/>
+          <w:sz w:val="20"/>
+          <w:szCs w:val="20"/>
+        </w:rPr>
+        <w:t xml:space="preserve">An earlier version of this dossier (v1.0) incorrectly attributed KAMP LA ownership and operations to Hello82. KAMP LA is owned and operated by KAMP Global (founder/CEO Tim Kim) in partnership with Eventim Live Asia (Jason Miller, ex-Live Nation Asia). It is not a Hello82 property. Hello82's own festival is 82WORLD : LA, a first-year outdoor event at LA State Historic Park, October 17–18, 2026. The financial model, sentiment analysis, and strategic recommendations below have been revised to remove KAMP-attributed economics, tighten the GMV / EV band, and reposition the festival-moat analysis against 82WORLD rather than KAMP. Credit: correction flagged by a reader with firsthand KAMP marketing experience.</w:t>
+      </w:r>
+    </w:p>
+    <w:p>
+      <w:pPr>
         <w:spacing w:after="140"/>
       </w:pPr>
       <w:r>
@@ -183,7 +213,7 @@
           <w:sz w:val="22"/>
           <w:szCs w:val="22"/>
         </w:rPr>
-        <w:t xml:space="preserve">Hello82 is an eight-year-old K-pop lifestyle and commerce company operating out of Los Angeles. It has built a defensible US position through three reinforcing layers: (a) ownership of the largest K-pop fan festival in North America (KAMP LA), (b) a commerce platform — Kpop82 — that acts as the licensed physical-goods storefront for dozens of Korean artists entering the US market, and (c) a management/label arm that now rosters acts such as JUNNY and xikers (US partnership). The moat is relationships, not technology or capital.</w:t>
+        <w:t xml:space="preserve">Hello82 is an eight-year-old K-pop lifestyle and commerce company operating out of Los Angeles. It has built a defensible US position through three reinforcing layers: (a) the PLAY82 pop-up event series and regional Fan Spaces (LA, NYC, Atlanta, Berlin), plus the new 82WORLD : LA festival launching October 17–18, 2026, (b) a commerce platform — Kpop82 — that acts as the licensed physical-goods storefront for dozens of Korean artists entering the US market, and (c) a management/label arm that now rosters acts such as JUNNY and xikers (US partnership). The moat is relationships, not technology or capital.</w:t>
       </w:r>
     </w:p>
     <w:p>
@@ -904,7 +934,7 @@
                 <w:sz w:val="18"/>
                 <w:szCs w:val="18"/>
               </w:rPr>
-              <w:t xml:space="preserve">85,000</w:t>
+              <w:t xml:space="preserve">80,000</w:t>
             </w:r>
           </w:p>
         </w:tc>
@@ -972,7 +1002,7 @@
                 <w:sz w:val="18"/>
                 <w:szCs w:val="18"/>
               </w:rPr>
-              <w:t xml:space="preserve">$85</w:t>
+              <w:t xml:space="preserve">$80</w:t>
             </w:r>
           </w:p>
         </w:tc>
@@ -1006,7 +1036,7 @@
                 <w:sz w:val="18"/>
                 <w:szCs w:val="18"/>
               </w:rPr>
-              <w:t xml:space="preserve">$289,000</w:t>
+              <w:t xml:space="preserve">$256,000</w:t>
             </w:r>
           </w:p>
         </w:tc>
@@ -1045,7 +1075,7 @@
                 <w:sz w:val="18"/>
                 <w:szCs w:val="18"/>
               </w:rPr>
-              <w:t xml:space="preserve">Bull (with KAMP halo)</w:t>
+              <w:t xml:space="preserve">Bull (PLAY82 + 82WORLD lift)</w:t>
             </w:r>
           </w:p>
         </w:tc>
@@ -1079,7 +1109,7 @@
                 <w:sz w:val="18"/>
                 <w:szCs w:val="18"/>
               </w:rPr>
-              <w:t xml:space="preserve">150,000</w:t>
+              <w:t xml:space="preserve">135,000</w:t>
             </w:r>
           </w:p>
         </w:tc>
@@ -1113,7 +1143,7 @@
                 <w:sz w:val="18"/>
                 <w:szCs w:val="18"/>
               </w:rPr>
-              <w:t xml:space="preserve">6.0%</w:t>
+              <w:t xml:space="preserve">5.5%</w:t>
             </w:r>
           </w:p>
         </w:tc>
@@ -1147,7 +1177,7 @@
                 <w:sz w:val="18"/>
                 <w:szCs w:val="18"/>
               </w:rPr>
-              <w:t xml:space="preserve">$100</w:t>
+              <w:t xml:space="preserve">$95</w:t>
             </w:r>
           </w:p>
         </w:tc>
@@ -1181,7 +1211,7 @@
                 <w:sz w:val="18"/>
                 <w:szCs w:val="18"/>
               </w:rPr>
-              <w:t xml:space="preserve">$900,000</w:t>
+              <w:t xml:space="preserve">$705,375</w:t>
             </w:r>
           </w:p>
         </w:tc>
@@ -1220,7 +1250,7 @@
                 <w:sz w:val="18"/>
                 <w:szCs w:val="18"/>
               </w:rPr>
-              <w:t xml:space="preserve">Upper (KAMP-week spike)</w:t>
+              <w:t xml:space="preserve">Upper (82WORLD-week, Oct 2026 unproven)</w:t>
             </w:r>
           </w:p>
         </w:tc>
@@ -1254,7 +1284,7 @@
                 <w:sz w:val="18"/>
                 <w:szCs w:val="18"/>
               </w:rPr>
-              <w:t xml:space="preserve">180,000</w:t>
+              <w:t xml:space="preserve">170,000</w:t>
             </w:r>
           </w:p>
         </w:tc>
@@ -1288,7 +1318,7 @@
                 <w:sz w:val="18"/>
                 <w:szCs w:val="18"/>
               </w:rPr>
-              <w:t xml:space="preserve">8.0%</w:t>
+              <w:t xml:space="preserve">7.0%</w:t>
             </w:r>
           </w:p>
         </w:tc>
@@ -1322,7 +1352,7 @@
                 <w:sz w:val="18"/>
                 <w:szCs w:val="18"/>
               </w:rPr>
-              <w:t xml:space="preserve">$120</w:t>
+              <w:t xml:space="preserve">$110</w:t>
             </w:r>
           </w:p>
         </w:tc>
@@ -1356,7 +1386,7 @@
                 <w:sz w:val="18"/>
                 <w:szCs w:val="18"/>
               </w:rPr>
-              <w:t xml:space="preserve">$1,728,000</w:t>
+              <w:t xml:space="preserve">$1,309,000</w:t>
             </w:r>
           </w:p>
         </w:tc>
@@ -1389,7 +1419,7 @@
           <w:sz w:val="18"/>
           <w:szCs w:val="18"/>
         </w:rPr>
-        <w:t xml:space="preserve">Bear and Bull bracket ~90% of plausible outcomes. Peak months (KAMP LA week, major artist drops) spike 3–5× baseline; base months trend lower. Weighted annual run rate sits in the $5–12M GMV band.</w:t>
+        <w:t xml:space="preserve">Bear and Bull bracket ~90% of plausible outcomes. Peak months (major artist drops, PLAY82 pop-up clusters) spike 2–4× baseline; base months trend lower. 82WORLD : LA is modeled separately given it has not yet executed a single show. Weighted annual run rate: $4–9M GMV band — tightened from v1.0 after removing KAMP-attributed revenue.</w:t>
       </w:r>
     </w:p>
     <w:p>
@@ -1468,7 +1498,7 @@
           <w:sz w:val="22"/>
           <w:szCs w:val="22"/>
         </w:rPr>
-        <w:t xml:space="preserve">KAMP merchandise &amp; event economics: </w:t>
+        <w:t xml:space="preserve">PLAY82 pop-up &amp; Fan Space economics: </w:t>
       </w:r>
       <w:r>
         <w:rPr>
@@ -1476,7 +1506,7 @@
           <w:sz w:val="22"/>
           <w:szCs w:val="22"/>
         </w:rPr>
-        <w:t xml:space="preserve">Ticketing yields 70–85% margin on the ticket bundle net of venue and production; merch capture at event runs 55–65% gross (higher than e-comm because no fulfillment leak).</w:t>
+        <w:t xml:space="preserve">Ticketed fan events (PLAY82 format) yield 55–70% gross margin on bundle net of venue / production / talent; on-site merch captures 55–65% gross (no fulfillment leak). 82WORLD : LA as a first-year festival carries unmodeled risk — margins disclosed only after October 2026 execution.</w:t>
       </w:r>
     </w:p>
     <w:p>
@@ -1518,7 +1548,7 @@
           <w:sz w:val="22"/>
           <w:szCs w:val="22"/>
         </w:rPr>
-        <w:t xml:space="preserve">Weighted blend: 50–58% gross margin company-wide in a realistic case; 60–65% in optimistic cases where KAMP is a larger share of revenue.</w:t>
+        <w:t xml:space="preserve">Weighted blend: 48–56% gross margin company-wide in a realistic case. Optimistic case (60%+) now requires successful 82WORLD execution, which is an unproven bet rather than an in-hand asset as v1.0 implied.</w:t>
       </w:r>
     </w:p>
     <w:p>
@@ -1800,7 +1830,7 @@
                 <w:sz w:val="18"/>
                 <w:szCs w:val="18"/>
               </w:rPr>
-              <w:t xml:space="preserve">$5–12M</w:t>
+              <w:t xml:space="preserve">$4–9M</w:t>
             </w:r>
           </w:p>
         </w:tc>
@@ -1902,7 +1932,7 @@
                 <w:sz w:val="18"/>
                 <w:szCs w:val="18"/>
               </w:rPr>
-              <w:t xml:space="preserve">$10–48M</w:t>
+              <w:t xml:space="preserve">$8–36M</w:t>
             </w:r>
           </w:p>
         </w:tc>
@@ -1975,7 +2005,7 @@
                 <w:sz w:val="18"/>
                 <w:szCs w:val="18"/>
               </w:rPr>
-              <w:t xml:space="preserve">$5–12M</w:t>
+              <w:t xml:space="preserve">$4–9M</w:t>
             </w:r>
           </w:p>
         </w:tc>
@@ -2077,7 +2107,7 @@
                 <w:sz w:val="18"/>
                 <w:szCs w:val="18"/>
               </w:rPr>
-              <w:t xml:space="preserve">$3.75–14.4M</w:t>
+              <w:t xml:space="preserve">$3–10.8M</w:t>
             </w:r>
           </w:p>
         </w:tc>
@@ -2150,7 +2180,7 @@
                 <w:sz w:val="18"/>
                 <w:szCs w:val="18"/>
               </w:rPr>
-              <w:t xml:space="preserve">$5–12M</w:t>
+              <w:t xml:space="preserve">$4–9M</w:t>
             </w:r>
           </w:p>
         </w:tc>
@@ -2252,7 +2282,7 @@
                 <w:sz w:val="18"/>
                 <w:szCs w:val="18"/>
               </w:rPr>
-              <w:t xml:space="preserve">$6–21.6M</w:t>
+              <w:t xml:space="preserve">$4.8–16.2M</w:t>
             </w:r>
           </w:p>
         </w:tc>
@@ -2427,7 +2457,7 @@
                 <w:sz w:val="18"/>
                 <w:szCs w:val="18"/>
               </w:rPr>
-              <w:t xml:space="preserve">$18–40M</w:t>
+              <w:t xml:space="preserve">$14–32M</w:t>
             </w:r>
           </w:p>
         </w:tc>
@@ -2458,7 +2488,7 @@
           <w:sz w:val="22"/>
           <w:szCs w:val="22"/>
         </w:rPr>
-        <w:t xml:space="preserve">A Korean-media-adjacent private company with no publicly-disclosed raise, no institutional PR around growth, and visibly strained operations tends to transact at the low end of these multiples. A realistic Hello82 strike-price range is $18–40M EV. WONDER's Series A capital requirement to land at scale is well inside this envelope.</w:t>
+        <w:t xml:space="preserve">A Korean-media-adjacent private company with no publicly-disclosed raise, no institutional PR around growth, and visibly strained operations tends to transact at the low end of these multiples. A realistic Hello82 strike-price range is $14–32M EV (tightened in v1.1 after removing KAMP-attributed revenue). WONDER's Series A capital requirement to land at scale is well inside this envelope.</w:t>
       </w:r>
     </w:p>
     <w:p>
@@ -2559,7 +2589,7 @@
           <w:sz w:val="22"/>
           <w:szCs w:val="22"/>
         </w:rPr>
-        <w:t xml:space="preserve">At the low end of the EV range ($18–25M), a friendly acquisition would cost ~30% more than 24 months of competitive spend and would buy KAMP LA outright. Worth modeling as a parallel track once WONDER has 6 months of operating data to justify the price.</w:t>
+        <w:t xml:space="preserve">At the low end of the EV range ($14–20M), a friendly acquisition would cost roughly 20–30% more than 24 months of competitive spend and would consolidate Hello82's operating footprint (Kpop82 commerce, PLAY82 series, management roster, and 82WORLD festival). Worth modeling as a parallel track once WONDER has 6 months of operating data to justify the price — and ideally after 82WORLD executes in October so festival performance is priced in.</w:t>
       </w:r>
     </w:p>
     <w:p>
@@ -3194,7 +3224,7 @@
                 <w:sz w:val="18"/>
                 <w:szCs w:val="18"/>
               </w:rPr>
-              <w:t xml:space="preserve">KAMP logistics + venue</w:t>
+              <w:t xml:space="preserve">PLAY82 / Fan Space logistics</w:t>
             </w:r>
           </w:p>
         </w:tc>
@@ -3565,7 +3595,7 @@
         </w:rPr>
         <w:t xml:space="preserve"> </w:t>
       </w:r>
-      <w:hyperlink w:history="1" r:id="rId1qr6rmbf2jftpqd2nlsl4">
+      <w:hyperlink w:history="1" r:id="rId7jokzai9vhqtavwkpzips">
         <w:r>
           <w:rPr>
             <w:rFonts w:ascii="Arial" w:cs="Arial" w:eastAsia="Arial" w:hAnsi="Arial"/>
@@ -3613,7 +3643,7 @@
         </w:rPr>
         <w:t xml:space="preserve"> </w:t>
       </w:r>
-      <w:hyperlink w:history="1" r:id="rIdv3z4ehultd-s_zr_rhwqo">
+      <w:hyperlink w:history="1" r:id="rIdomb89doh18zwimkqqyyy9">
         <w:r>
           <w:rPr>
             <w:rFonts w:ascii="Arial" w:cs="Arial" w:eastAsia="Arial" w:hAnsi="Arial"/>
@@ -3678,7 +3708,7 @@
         </w:rPr>
         <w:t xml:space="preserve"> </w:t>
       </w:r>
-      <w:hyperlink w:history="1" r:id="rIdueick_qwfxsqs-9ph04yc">
+      <w:hyperlink w:history="1" r:id="rIdzvhf5xsx4xk2p8yu93nhu">
         <w:r>
           <w:rPr>
             <w:rFonts w:ascii="Arial" w:cs="Arial" w:eastAsia="Arial" w:hAnsi="Arial"/>
@@ -3726,7 +3756,7 @@
         </w:rPr>
         <w:t xml:space="preserve"> </w:t>
       </w:r>
-      <w:hyperlink w:history="1" r:id="rIdpcugn79vnbialke-5witt">
+      <w:hyperlink w:history="1" r:id="rIdpgsqtxhmx-fat7jornibb">
         <w:r>
           <w:rPr>
             <w:rFonts w:ascii="Arial" w:cs="Arial" w:eastAsia="Arial" w:hAnsi="Arial"/>
@@ -3791,7 +3821,7 @@
         </w:rPr>
         <w:t xml:space="preserve"> </w:t>
       </w:r>
-      <w:hyperlink w:history="1" r:id="rIdl7ecq7wh6nlyhke016se2">
+      <w:hyperlink w:history="1" r:id="rIdncukxbrnc8cikcz91rdqg">
         <w:r>
           <w:rPr>
             <w:rFonts w:ascii="Arial" w:cs="Arial" w:eastAsia="Arial" w:hAnsi="Arial"/>
@@ -3818,72 +3848,7 @@
           <w:sz w:val="22"/>
           <w:szCs w:val="22"/>
         </w:rPr>
-        <w:t xml:space="preserve">Pattern 4 — Event pain (KAMP LA)</w:t>
-      </w:r>
-    </w:p>
-    <w:p>
-      <w:pPr>
-        <w:pBdr>
-          <w:left w:val="single" w:color="FD3737" w:sz="12" w:space="8"/>
-        </w:pBdr>
-        <w:spacing w:after="180"/>
-        <w:ind w:left="360"/>
-      </w:pPr>
-      <w:r>
-        <w:rPr>
-          <w:rFonts w:ascii="Arial" w:cs="Arial" w:eastAsia="Arial" w:hAnsi="Arial"/>
-          <w:i/>
-          <w:iCs/>
-          <w:color w:val="111111"/>
-          <w:sz w:val="22"/>
-          <w:szCs w:val="22"/>
-        </w:rPr>
-        <w:t xml:space="preserve">"Paid $200 for KAMP LA VIP. Queues were 3 hours. Merch sold out in 40 minutes. No in-and-out. For that price I want Disneyland operations."</w:t>
-      </w:r>
-      <w:r>
-        <w:rPr>
-          <w:rFonts w:ascii="Arial" w:cs="Arial" w:eastAsia="Arial" w:hAnsi="Arial"/>
-          <w:color w:val="555555"/>
-          <w:sz w:val="18"/>
-          <w:szCs w:val="18"/>
-        </w:rPr>
-        <w:t xml:space="preserve">  — bumsniffer, Reddit, 2024</w:t>
-      </w:r>
-      <w:r>
-        <w:rPr>
-          <w:sz w:val="18"/>
-          <w:szCs w:val="18"/>
-        </w:rPr>
-        <w:t xml:space="preserve"> </w:t>
-      </w:r>
-      <w:hyperlink w:history="1" r:id="rIdd-65re4gf6q0xtizrqeun">
-        <w:r>
-          <w:rPr>
-            <w:rFonts w:ascii="Arial" w:cs="Arial" w:eastAsia="Arial" w:hAnsi="Arial"/>
-            <w:color w:val="0563C1"/>
-            <w:sz w:val="18"/>
-            <w:szCs w:val="18"/>
-            <w:u w:val="single"/>
-          </w:rPr>
-          <w:t xml:space="preserve">(source)</w:t>
-        </w:r>
-      </w:hyperlink>
-    </w:p>
-    <w:p>
-      <w:pPr>
-        <w:pStyle w:val="Heading3"/>
-        <w:spacing w:after="120" w:before="240"/>
-      </w:pPr>
-      <w:r>
-        <w:rPr>
-          <w:rFonts w:ascii="Arial" w:cs="Arial" w:eastAsia="Arial" w:hAnsi="Arial"/>
-          <w:b/>
-          <w:bCs/>
-          <w:color w:val="FD3737"/>
-          <w:sz w:val="22"/>
-          <w:szCs w:val="22"/>
-        </w:rPr>
-        <w:t xml:space="preserve">Pattern 5 — Refund friction</w:t>
+        <w:t xml:space="preserve">Pattern 4 — Refund friction</w:t>
       </w:r>
     </w:p>
     <w:p>
@@ -11785,7 +11750,7 @@
           <w:sz w:val="22"/>
           <w:szCs w:val="22"/>
         </w:rPr>
-        <w:t xml:space="preserve">Open a physical LA experience space — pop-up or lease 2,000-sqft retail, timed to precede KAMP LA week.</w:t>
+        <w:t xml:space="preserve">Open a physical LA experience space — pop-up or lease 2,000-sqft retail. Ideally timed ahead of 82WORLD : LA (October 2026) to capture festival-adjacent foot traffic, or ahead of a major artist tour stop.</w:t>
       </w:r>
     </w:p>
     <w:p>
@@ -15467,7 +15432,7 @@
                 <w:sz w:val="18"/>
                 <w:szCs w:val="18"/>
               </w:rPr>
-              <w:t xml:space="preserve">KAMP LA bookings, MD tour</w:t>
+              <w:t xml:space="preserve">Hello82 MD for US tour; PLAY82 activations</w:t>
             </w:r>
           </w:p>
         </w:tc>
@@ -15574,7 +15539,7 @@
                 <w:sz w:val="18"/>
                 <w:szCs w:val="18"/>
               </w:rPr>
-              <w:t xml:space="preserve">Event partner (KAMP LA)</w:t>
+              <w:t xml:space="preserve">Pop-up / content appearances</w:t>
             </w:r>
           </w:p>
         </w:tc>
@@ -15608,7 +15573,7 @@
                 <w:sz w:val="18"/>
                 <w:szCs w:val="18"/>
               </w:rPr>
-              <w:t xml:space="preserve">KAMP LA 2023/2024 line-ups</w:t>
+              <w:t xml:space="preserve">Hello82 YouTube content + Fan Space hosting</w:t>
             </w:r>
           </w:p>
         </w:tc>
@@ -16138,7 +16103,7 @@
                 <w:sz w:val="18"/>
                 <w:szCs w:val="18"/>
               </w:rPr>
-              <w:t xml:space="preserve">Licensed merch + event</w:t>
+              <w:t xml:space="preserve">Licensed merch + pop-ups</w:t>
             </w:r>
           </w:p>
         </w:tc>
@@ -16172,7 +16137,7 @@
                 <w:sz w:val="18"/>
                 <w:szCs w:val="18"/>
               </w:rPr>
-              <w:t xml:space="preserve">KAMP LA + Kpop82</w:t>
+              <w:t xml:space="preserve">12+ Hello82 pop-ups in 2022; Kpop82 SKUs</w:t>
             </w:r>
           </w:p>
         </w:tc>
@@ -16591,7 +16556,7 @@
           <w:sz w:val="22"/>
           <w:szCs w:val="22"/>
         </w:rPr>
-        <w:t xml:space="preserve">Venue relationships: Crypto.com Arena, Pasadena Rose Bowl, BMO Stadium (KAMP LA history).</w:t>
+        <w:t xml:space="preserve">Venue footprint: PLAY82 pop-up venues (LA, NYC, Atlanta, Berlin); LA State Historic Park booked for 82WORLD : LA, October 2026.</w:t>
       </w:r>
     </w:p>
     <w:p>
@@ -16610,7 +16575,7 @@
           <w:sz w:val="22"/>
           <w:szCs w:val="22"/>
         </w:rPr>
-        <w:t xml:space="preserve">Sponsorship footprint: LG, Samsung, Hyundai-adjacent brands (visible at KAMP LA).</w:t>
+        <w:t xml:space="preserve">Sponsor footprint: not yet disclosed for 82WORLD : LA; watch announcement cadence ahead of October 2026.</w:t>
       </w:r>
     </w:p>
     <w:p>
@@ -16803,7 +16768,7 @@
           <w:sz w:val="22"/>
           <w:szCs w:val="22"/>
         </w:rPr>
-        <w:t xml:space="preserve">KAMP LA is Hello82's hardest-to-replicate asset. WONDER cannot build an equivalent festival inside the launch window. Instead, build a permanent LA experience space — 2,000-3,000 sqft retail + event venue — and host 24-36 small artist events per year (100-300 attendees each). This is the 'always-on' alternative to an annual festival. Lower revenue per event, higher customer lifetime value, continuous content flywheel. CapEx: $800K-1.2M. Month-18 payback via CX + email + creator amplification.</w:t>
+        <w:t xml:space="preserve">82WORLD : LA is Hello82's festival bet — but it is a first-year, single-weekend property that has not yet executed. WONDER should NOT try to replicate it with a competing annual festival (high capex, hard to differentiate, slow payback). Instead, build a permanent LA experience space — 2,000–3,000 sqft retail + event venue — and host 24–36 small artist events per year (100–300 attendees each). This is an 'always-on' alternative that compounds content, community, and commerce every week of the year instead of one weekend. Lower revenue per event, higher customer lifetime value, continuous content flywheel. CapEx: $800K–1.2M. Month-18 payback via CX + email + creator amplification. If 82WORLD under-delivers in October 2026, WONDER's always-on format looks structurally superior in hindsight; if it over-delivers, the always-on format still complements rather than competes.</w:t>
       </w:r>
     </w:p>
     <w:p>
@@ -19000,7 +18965,7 @@
                 <w:sz w:val="18"/>
                 <w:szCs w:val="18"/>
               </w:rPr>
-              <w:t xml:space="preserve">KAMP LA economics</w:t>
+              <w:t xml:space="preserve">82WORLD : LA economics</w:t>
             </w:r>
           </w:p>
         </w:tc>
@@ -19034,7 +18999,7 @@
                 <w:sz w:val="18"/>
                 <w:szCs w:val="18"/>
               </w:rPr>
-              <w:t xml:space="preserve">Ticket revenue, sponsor revenue, margin by line</w:t>
+              <w:t xml:space="preserve">Pre-sale volume, sponsor stack, true cost basis</w:t>
             </w:r>
           </w:p>
         </w:tc>
@@ -19068,7 +19033,7 @@
                 <w:sz w:val="18"/>
                 <w:szCs w:val="18"/>
               </w:rPr>
-              <w:t xml:space="preserve">Venue filings + sponsor RFP archives</w:t>
+              <w:t xml:space="preserve">Monitor Oct 2026 execution + post-event disclosure</w:t>
             </w:r>
           </w:p>
         </w:tc>
@@ -19181,7 +19146,7 @@
           <w:sz w:val="22"/>
           <w:szCs w:val="22"/>
         </w:rPr>
-        <w:t xml:space="preserve">Week 3-5: Factiva + Nexis press audit for any disclosure of KAMP LA venue contracts, sponsor integrations, or label deal announcements missed in web search. Deliverable: partnership calendar + escalation risks. Cost: ~$3K.</w:t>
+        <w:t xml:space="preserve">Week 3-5: Factiva + Nexis press audit for 82WORLD : LA pre-sale momentum, sponsor stack, venue contracts, and any label deal announcements missed in web search. Deliverable: partnership calendar + escalation risks. Cost: ~$3K.</w:t>
       </w:r>
     </w:p>
     <w:p>
@@ -19260,7 +19225,7 @@
         </w:rPr>
         <w:t xml:space="preserve">· Trustpilot — kpop82.com review corpus: </w:t>
       </w:r>
-      <w:hyperlink w:history="1" r:id="rId2ja0ddvwfufebpiy9eydi">
+      <w:hyperlink w:history="1" r:id="rIddr-qcigfkkxp9znfpa4go">
         <w:r>
           <w:rPr>
             <w:rFonts w:ascii="Arial" w:cs="Arial" w:eastAsia="Arial" w:hAnsi="Arial"/>
@@ -19298,7 +19263,7 @@
         </w:rPr>
         <w:t xml:space="preserve">· KOSPI filings — YG Plus (037270): </w:t>
       </w:r>
-      <w:hyperlink w:history="1" r:id="rIdzvmi2bto3cdemochet7ug">
+      <w:hyperlink w:history="1" r:id="rIdprjximux4irc3s68qpayz">
         <w:r>
           <w:rPr>
             <w:rFonts w:ascii="Arial" w:cs="Arial" w:eastAsia="Arial" w:hAnsi="Arial"/>
@@ -19349,7 +19314,7 @@
         </w:rPr>
         <w:t xml:space="preserve">· Companion audit: </w:t>
       </w:r>
-      <w:hyperlink w:history="1" r:id="rIdags_4usmjr4mbxmlxfrjf">
+      <w:hyperlink w:history="1" r:id="rIdx97s3-43bkbubdjgpmllp">
         <w:r>
           <w:rPr>
             <w:rFonts w:ascii="Arial" w:cs="Arial" w:eastAsia="Arial" w:hAnsi="Arial"/>

</xml_diff>